<commit_message>
git hib link added
</commit_message>
<xml_diff>
--- a/reports/Report.docx
+++ b/reports/Report.docx
@@ -28,14 +28,6 @@
           <w:szCs w:val="22"/>
         </w:rPr>
       </w:pPr>
-    </w:p>
-    <w:p>
-      <w:pPr>
-        <w:rPr>
-          <w:sz w:val="22"/>
-          <w:szCs w:val="22"/>
-        </w:rPr>
-      </w:pPr>
       <w:r>
         <w:rPr>
           <w:b/>
@@ -43,38 +35,25 @@
           <w:sz w:val="22"/>
           <w:szCs w:val="22"/>
         </w:rPr>
-        <w:t>1. Overview</w:t>
-      </w:r>
-    </w:p>
-    <w:p>
-      <w:pPr>
-        <w:rPr>
-          <w:sz w:val="22"/>
-          <w:szCs w:val="22"/>
-        </w:rPr>
-      </w:pPr>
-      <w:r>
-        <w:rPr>
-          <w:sz w:val="22"/>
-          <w:szCs w:val="22"/>
-        </w:rPr>
-        <w:t>This project focuses on analysing the Kazakhstan National Human Development Report 2002: Rural Development in Kazakhstan – Challenges and Prospects using locally hosted large language models. The main goal was to extract useful information from the PDF, including chapter summaries, development indicators and major themes, and present the results in an interactive dashboard. To understand which model performed better, the outputs from two extraction models were compared using a separate evaluation model.</w:t>
-      </w:r>
-    </w:p>
-    <w:p>
-      <w:pPr>
-        <w:rPr>
-          <w:sz w:val="22"/>
-          <w:szCs w:val="22"/>
-        </w:rPr>
-      </w:pPr>
-      <w:r>
-        <w:rPr>
-          <w:sz w:val="22"/>
-          <w:szCs w:val="22"/>
-        </w:rPr>
-        <w:t>The report contains 123 pages. After extracting and cleaning the text, a total of 38,944 words remained and were divided into four chapter-based sections for processing. Information extraction was carried out using qwen2.5:7b and llama3.1:8b, while gemma2:9b was used to evaluate and compare the extracted results. All models were executed locally through Ollama, allowing the entire pipeline to run without cloud-based services.</w:t>
-      </w:r>
+        <w:t>GitHub Link</w:t>
+      </w:r>
+      <w:r>
+        <w:rPr>
+          <w:sz w:val="22"/>
+          <w:szCs w:val="22"/>
+        </w:rPr>
+        <w:t xml:space="preserve">: </w:t>
+      </w:r>
+      <w:hyperlink r:id="rId4" w:history="1">
+        <w:r>
+          <w:rPr>
+            <w:rStyle w:val="Hyperlink"/>
+            <w:sz w:val="22"/>
+            <w:szCs w:val="22"/>
+          </w:rPr>
+          <w:t>Mohan/LLM-Kazakhstan-2002-Case-Study</w:t>
+        </w:r>
+      </w:hyperlink>
     </w:p>
     <w:p>
       <w:pPr>
@@ -90,8 +69,46 @@
           <w:sz w:val="22"/>
           <w:szCs w:val="22"/>
         </w:rPr>
-        <w:t>2. Method</w:t>
-      </w:r>
+        <w:t>1. Overview</w:t>
+      </w:r>
+    </w:p>
+    <w:p>
+      <w:pPr>
+        <w:rPr>
+          <w:sz w:val="22"/>
+          <w:szCs w:val="22"/>
+        </w:rPr>
+      </w:pPr>
+      <w:r>
+        <w:rPr>
+          <w:sz w:val="22"/>
+          <w:szCs w:val="22"/>
+        </w:rPr>
+        <w:t>This project focuses on analysing the Kazakhstan National Human Development Report 2002: Rural Development in Kazakhstan – Challenges and Prospects using locally hosted large language models. The main goal was to extract useful information from the PDF, including chapter summaries, development indicators and major themes, and present the results in an interactive dashboard. To understand which model performed better, the outputs from two extraction models were compared using a separate evaluation model.</w:t>
+      </w:r>
+    </w:p>
+    <w:p>
+      <w:pPr>
+        <w:rPr>
+          <w:sz w:val="22"/>
+          <w:szCs w:val="22"/>
+        </w:rPr>
+      </w:pPr>
+      <w:r>
+        <w:rPr>
+          <w:sz w:val="22"/>
+          <w:szCs w:val="22"/>
+        </w:rPr>
+        <w:t>The report contains 123 pages. After extracting and cleaning the text, a total of 38,944 words remained and were divided into four chapter-based sections for processing. Information extraction was carried out using qwen2.5:7b and llama3.1:8b, while gemma2:9b was used to evaluate and compare the extracted results. All models were executed locally through Ollama, allowing the entire pipeline to run without cloud-based services.</w:t>
+      </w:r>
+    </w:p>
+    <w:p>
+      <w:pPr>
+        <w:rPr>
+          <w:sz w:val="22"/>
+          <w:szCs w:val="22"/>
+        </w:rPr>
+      </w:pPr>
       <w:r>
         <w:rPr>
           <w:b/>
@@ -99,115 +116,8 @@
           <w:sz w:val="22"/>
           <w:szCs w:val="22"/>
         </w:rPr>
-        <w:t>s</w:t>
-      </w:r>
-    </w:p>
-    <w:p>
-      <w:pPr>
-        <w:rPr>
-          <w:sz w:val="22"/>
-          <w:szCs w:val="22"/>
-        </w:rPr>
-      </w:pPr>
-      <w:r>
-        <w:rPr>
-          <w:sz w:val="22"/>
-          <w:szCs w:val="22"/>
-        </w:rPr>
-        <w:t>The overall workflow was divided into four stages, covering data preparation, information extraction and model evaluation.</w:t>
-      </w:r>
-    </w:p>
-    <w:p>
-      <w:pPr>
-        <w:rPr>
-          <w:sz w:val="22"/>
-          <w:szCs w:val="22"/>
-        </w:rPr>
-      </w:pPr>
-      <w:r>
-        <w:rPr>
-          <w:sz w:val="22"/>
-          <w:szCs w:val="22"/>
-        </w:rPr>
-        <w:t>The first stage focused on processing the source PDF. The report was loaded using the pypdf library, after which the extracted text was cleaned by removing repeated headers, page numbers and unnecessary line breaks. During preprocessing, it was noticed that the table of contents and some section headings were not extracted consistently because of the PDF layout. To avoid this issue, the report was manually divided according to its original chapter structure, resulting in four chapter-based chunks.</w:t>
-      </w:r>
-    </w:p>
-    <w:p>
-      <w:pPr>
-        <w:rPr>
-          <w:sz w:val="22"/>
-          <w:szCs w:val="22"/>
-        </w:rPr>
-      </w:pPr>
-      <w:r>
-        <w:rPr>
-          <w:sz w:val="22"/>
-          <w:szCs w:val="22"/>
-        </w:rPr>
-        <w:t>The second stage involved deterministic extraction before applying the LLMs. Theme keywords were counted across seven categories: education, health, inequality, economy, gender, climate/environment and employment. In addition, evidence lines containing development indicators were identified by searching for terms such as HDI, GDP, population, poverty, wages, health, education and unemployment in sentences that included numerical values. This ensured that important quantitative information could be retained for later analysis.</w:t>
-      </w:r>
-    </w:p>
-    <w:p>
-      <w:pPr>
-        <w:rPr>
-          <w:sz w:val="22"/>
-          <w:szCs w:val="22"/>
-        </w:rPr>
-      </w:pPr>
-    </w:p>
-    <w:p>
-      <w:pPr>
-        <w:rPr>
-          <w:sz w:val="22"/>
-          <w:szCs w:val="22"/>
-        </w:rPr>
-      </w:pPr>
-      <w:r>
-        <w:rPr>
-          <w:sz w:val="22"/>
-          <w:szCs w:val="22"/>
-        </w:rPr>
-        <w:t>The third stage used two locally hosted LLMs, qwen2.5:7b and llama3.1:8b, to generate structured JSON outputs. Each model produced chapter summaries of fewer than 100 words together with key points, numerical indicators, full-report findings, strengths, challenges, theme analysis and dashboard plot ideas. Using a structured JSON format made it easier to compare the outputs from both models and integrate the extracted information into the dashboard.</w:t>
-      </w:r>
-    </w:p>
-    <w:p>
-      <w:pPr>
-        <w:rPr>
-          <w:sz w:val="22"/>
-          <w:szCs w:val="22"/>
-        </w:rPr>
-      </w:pPr>
-      <w:r>
-        <w:rPr>
-          <w:sz w:val="22"/>
-          <w:szCs w:val="22"/>
-        </w:rPr>
-        <w:t>The final stage involved evaluating the outputs generated by the two extraction models. The gemma2:9b model was used as an independent evaluator and compared both outputs against the evidence lines extracted from the report. It assessed consistency, completeness, factual alignment, numerical extraction and dashboard usefulness before recommending which model produced better summaries and indicator extraction.</w:t>
-      </w:r>
-    </w:p>
-    <w:p>
-      <w:pPr>
-        <w:rPr>
-          <w:sz w:val="22"/>
-          <w:szCs w:val="22"/>
-        </w:rPr>
-      </w:pPr>
-    </w:p>
-    <w:p>
-      <w:pPr>
-        <w:rPr>
-          <w:sz w:val="22"/>
-          <w:szCs w:val="22"/>
-        </w:rPr>
-      </w:pPr>
-    </w:p>
-    <w:p>
-      <w:pPr>
-        <w:rPr>
-          <w:sz w:val="22"/>
-          <w:szCs w:val="22"/>
-        </w:rPr>
-      </w:pPr>
+        <w:t>2. Method</w:t>
+      </w:r>
       <w:r>
         <w:rPr>
           <w:b/>
@@ -215,6 +125,122 @@
           <w:sz w:val="22"/>
           <w:szCs w:val="22"/>
         </w:rPr>
+        <w:t>s</w:t>
+      </w:r>
+    </w:p>
+    <w:p>
+      <w:pPr>
+        <w:rPr>
+          <w:sz w:val="22"/>
+          <w:szCs w:val="22"/>
+        </w:rPr>
+      </w:pPr>
+      <w:r>
+        <w:rPr>
+          <w:sz w:val="22"/>
+          <w:szCs w:val="22"/>
+        </w:rPr>
+        <w:t>The overall workflow was divided into four stages, covering data preparation, information extraction and model evaluation.</w:t>
+      </w:r>
+    </w:p>
+    <w:p>
+      <w:pPr>
+        <w:rPr>
+          <w:sz w:val="22"/>
+          <w:szCs w:val="22"/>
+        </w:rPr>
+      </w:pPr>
+      <w:r>
+        <w:rPr>
+          <w:sz w:val="22"/>
+          <w:szCs w:val="22"/>
+        </w:rPr>
+        <w:t>The first stage focused on processing the source PDF. The report was loaded using the pypdf library, after which the extracted text was cleaned by removing repeated headers, page numbers and unnecessary line breaks. During preprocessing, it was noticed that the table of contents and some section headings were not extracted consistently because of the PDF layout. To avoid this issue, the report was manually divided according to its original chapter structure, resulting in four chapter-based chunks.</w:t>
+      </w:r>
+    </w:p>
+    <w:p>
+      <w:pPr>
+        <w:rPr>
+          <w:sz w:val="22"/>
+          <w:szCs w:val="22"/>
+        </w:rPr>
+      </w:pPr>
+      <w:r>
+        <w:rPr>
+          <w:sz w:val="22"/>
+          <w:szCs w:val="22"/>
+        </w:rPr>
+        <w:t>The second stage involved deterministic extraction before applying the LLMs. Theme keywords were counted across seven categories: education, health, inequality, economy, gender, climate/environment and employment. In addition, evidence lines containing development indicators were identified by searching for terms such as HDI, GDP, population, poverty, wages, health, education and unemployment in sentences that included numerical values. This ensured that important quantitative information could be retained for later analysis.</w:t>
+      </w:r>
+    </w:p>
+    <w:p>
+      <w:pPr>
+        <w:rPr>
+          <w:sz w:val="22"/>
+          <w:szCs w:val="22"/>
+        </w:rPr>
+      </w:pPr>
+    </w:p>
+    <w:p>
+      <w:pPr>
+        <w:rPr>
+          <w:sz w:val="22"/>
+          <w:szCs w:val="22"/>
+        </w:rPr>
+      </w:pPr>
+      <w:r>
+        <w:rPr>
+          <w:sz w:val="22"/>
+          <w:szCs w:val="22"/>
+        </w:rPr>
+        <w:t>The third stage used two locally hosted LLMs, qwen2.5:7b and llama3.1:8b, to generate structured JSON outputs. Each model produced chapter summaries of fewer than 100 words together with key points, numerical indicators, full-report findings, strengths, challenges, theme analysis and dashboard plot ideas. Using a structured JSON format made it easier to compare the outputs from both models and integrate the extracted information into the dashboard.</w:t>
+      </w:r>
+    </w:p>
+    <w:p>
+      <w:pPr>
+        <w:rPr>
+          <w:sz w:val="22"/>
+          <w:szCs w:val="22"/>
+        </w:rPr>
+      </w:pPr>
+      <w:r>
+        <w:rPr>
+          <w:sz w:val="22"/>
+          <w:szCs w:val="22"/>
+        </w:rPr>
+        <w:t>The final stage involved evaluating the outputs generated by the two extraction models. The gemma2:9b model was used as an independent evaluator and compared both outputs against the evidence lines extracted from the report. It assessed consistency, completeness, factual alignment, numerical extraction and dashboard usefulness before recommending which model produced better summaries and indicator extraction.</w:t>
+      </w:r>
+    </w:p>
+    <w:p>
+      <w:pPr>
+        <w:rPr>
+          <w:sz w:val="22"/>
+          <w:szCs w:val="22"/>
+        </w:rPr>
+      </w:pPr>
+    </w:p>
+    <w:p>
+      <w:pPr>
+        <w:rPr>
+          <w:sz w:val="22"/>
+          <w:szCs w:val="22"/>
+        </w:rPr>
+      </w:pPr>
+    </w:p>
+    <w:p>
+      <w:pPr>
+        <w:rPr>
+          <w:sz w:val="22"/>
+          <w:szCs w:val="22"/>
+        </w:rPr>
+      </w:pPr>
+      <w:r>
+        <w:rPr>
+          <w:b/>
+          <w:bCs/>
+          <w:sz w:val="22"/>
+          <w:szCs w:val="22"/>
+        </w:rPr>
         <w:lastRenderedPageBreak/>
         <w:t xml:space="preserve">3. </w:t>
       </w:r>
@@ -419,14 +445,7 @@
           <w:sz w:val="22"/>
           <w:szCs w:val="22"/>
         </w:rPr>
-        <w:t xml:space="preserve"> 1: </w:t>
-      </w:r>
-      <w:r>
-        <w:rPr>
-          <w:sz w:val="22"/>
-          <w:szCs w:val="22"/>
-        </w:rPr>
-        <w:t>Distribution of Extracted Development Themes</w:t>
+        <w:t xml:space="preserve"> 1: Distribution of Extracted Development Themes</w:t>
       </w:r>
       <w:r>
         <w:rPr>
@@ -854,36 +873,18 @@
           <w:sz w:val="22"/>
           <w:szCs w:val="22"/>
         </w:rPr>
-        <w:t>Table</w:t>
-      </w:r>
-      <w:r>
+        <w:t>Table 1: Distribution of Extracted Development Themes</w:t>
+      </w:r>
+    </w:p>
+    <w:p>
+      <w:pPr>
+        <w:ind w:left="1440" w:firstLine="720"/>
         <w:rPr>
           <w:i/>
           <w:iCs/>
           <w:sz w:val="22"/>
           <w:szCs w:val="22"/>
         </w:rPr>
-        <w:t xml:space="preserve"> 1</w:t>
-      </w:r>
-      <w:r>
-        <w:rPr>
-          <w:i/>
-          <w:iCs/>
-          <w:sz w:val="22"/>
-          <w:szCs w:val="22"/>
-        </w:rPr>
-        <w:t>: Distribution of Extracted Development Themes</w:t>
-      </w:r>
-    </w:p>
-    <w:p>
-      <w:pPr>
-        <w:ind w:left="1440" w:firstLine="720"/>
-        <w:rPr>
-          <w:i/>
-          <w:iCs/>
-          <w:sz w:val="22"/>
-          <w:szCs w:val="22"/>
-        </w:rPr>
       </w:pPr>
     </w:p>
     <w:p>
@@ -1149,14 +1150,7 @@
           <w:sz w:val="22"/>
           <w:szCs w:val="22"/>
         </w:rPr>
-        <w:t xml:space="preserve">2: </w:t>
-      </w:r>
-      <w:r>
-        <w:rPr>
-          <w:sz w:val="22"/>
-          <w:szCs w:val="22"/>
-        </w:rPr>
-        <w:t>Dashboard Visualisations and Their Purpose</w:t>
+        <w:t>2: Dashboard Visualisations and Their Purpose</w:t>
       </w:r>
       <w:r>
         <w:rPr>
@@ -1451,32 +1445,24 @@
           <w:sz w:val="22"/>
           <w:szCs w:val="22"/>
         </w:rPr>
-        <w:t xml:space="preserve">Table 2: </w:t>
-      </w:r>
-      <w:r>
-        <w:rPr>
-          <w:i/>
-          <w:iCs/>
-          <w:sz w:val="22"/>
-          <w:szCs w:val="22"/>
-        </w:rPr>
-        <w:t>Dashboard Visualisations and Their Purpose</w:t>
-      </w:r>
-    </w:p>
-    <w:p>
-      <w:pPr>
-        <w:rPr>
-          <w:sz w:val="22"/>
-          <w:szCs w:val="22"/>
-        </w:rPr>
-      </w:pPr>
-      <w:r>
-        <w:rPr>
+        <w:t>Table 2: Dashboard Visualisations and Their Purpose</w:t>
+      </w:r>
+    </w:p>
+    <w:p>
+      <w:pPr>
+        <w:rPr>
+          <w:sz w:val="22"/>
+          <w:szCs w:val="22"/>
+        </w:rPr>
+      </w:pPr>
+      <w:r>
+        <w:rPr>
+          <w:noProof/>
           <w:sz w:val="22"/>
           <w:szCs w:val="22"/>
         </w:rPr>
         <w:drawing>
-          <wp:anchor distT="0" distB="0" distL="114300" distR="114300" simplePos="0" relativeHeight="251658240" behindDoc="0" locked="0" layoutInCell="1" allowOverlap="1" wp14:anchorId="1A247150" wp14:editId="350D6DE3">
+          <wp:anchor distT="0" distB="0" distL="114300" distR="114300" simplePos="0" relativeHeight="251658240" behindDoc="0" locked="0" layoutInCell="1" allowOverlap="1" wp14:anchorId="1A247150" wp14:editId="461613CB">
             <wp:simplePos x="0" y="0"/>
             <wp:positionH relativeFrom="column">
               <wp:posOffset>-758825</wp:posOffset>
@@ -1499,7 +1485,7 @@
                     <pic:cNvPicPr/>
                   </pic:nvPicPr>
                   <pic:blipFill>
-                    <a:blip r:embed="rId4" cstate="print">
+                    <a:blip r:embed="rId5" cstate="print">
                       <a:extLst>
                         <a:ext uri="{28A0092B-C50C-407E-A947-70E740481C1C}">
                           <a14:useLocalDpi xmlns:a14="http://schemas.microsoft.com/office/drawing/2010/main" val="0"/>
@@ -1629,12 +1615,13 @@
       </w:pPr>
       <w:r>
         <w:rPr>
+          <w:noProof/>
           <w:sz w:val="22"/>
           <w:szCs w:val="22"/>
         </w:rPr>
         <w:lastRenderedPageBreak/>
         <w:drawing>
-          <wp:anchor distT="0" distB="0" distL="114300" distR="114300" simplePos="0" relativeHeight="251659264" behindDoc="0" locked="0" layoutInCell="1" allowOverlap="1" wp14:anchorId="5A97AA7E" wp14:editId="28573809">
+          <wp:anchor distT="0" distB="0" distL="114300" distR="114300" simplePos="0" relativeHeight="251659264" behindDoc="0" locked="0" layoutInCell="1" allowOverlap="1" wp14:anchorId="5A97AA7E" wp14:editId="6A7282F0">
             <wp:simplePos x="0" y="0"/>
             <wp:positionH relativeFrom="column">
               <wp:posOffset>-368484</wp:posOffset>
@@ -1657,7 +1644,7 @@
                     <pic:cNvPicPr/>
                   </pic:nvPicPr>
                   <pic:blipFill>
-                    <a:blip r:embed="rId5" cstate="print">
+                    <a:blip r:embed="rId6" cstate="print">
                       <a:extLst>
                         <a:ext uri="{28A0092B-C50C-407E-A947-70E740481C1C}">
                           <a14:useLocalDpi xmlns:a14="http://schemas.microsoft.com/office/drawing/2010/main" val="0"/>
@@ -2052,7 +2039,7 @@
         </w:rPr>
         <w:t xml:space="preserve">. Available at: </w:t>
       </w:r>
-      <w:hyperlink r:id="rId6" w:tgtFrame="_new" w:history="1">
+      <w:hyperlink r:id="rId7" w:tgtFrame="_new" w:history="1">
         <w:r>
           <w:rPr>
             <w:rStyle w:val="Hyperlink"/>
@@ -2061,27 +2048,7 @@
             <w:sz w:val="22"/>
             <w:szCs w:val="22"/>
           </w:rPr>
-          <w:t>https://hdr.und</w:t>
-        </w:r>
-        <w:r>
-          <w:rPr>
-            <w:rStyle w:val="Hyperlink"/>
-            <w:b/>
-            <w:bCs/>
-            <w:sz w:val="22"/>
-            <w:szCs w:val="22"/>
-          </w:rPr>
-          <w:t>p</w:t>
-        </w:r>
-        <w:r>
-          <w:rPr>
-            <w:rStyle w:val="Hyperlink"/>
-            <w:b/>
-            <w:bCs/>
-            <w:sz w:val="22"/>
-            <w:szCs w:val="22"/>
-          </w:rPr>
-          <w:t>.org/</w:t>
+          <w:t>https://hdr.undp.org/</w:t>
         </w:r>
       </w:hyperlink>
     </w:p>
@@ -2115,7 +2082,7 @@
         </w:rPr>
         <w:t xml:space="preserve">. Available at: </w:t>
       </w:r>
-      <w:hyperlink r:id="rId7" w:tgtFrame="_new" w:history="1">
+      <w:hyperlink r:id="rId8" w:tgtFrame="_new" w:history="1">
         <w:r>
           <w:rPr>
             <w:rStyle w:val="Hyperlink"/>
@@ -2156,7 +2123,7 @@
         </w:rPr>
         <w:t xml:space="preserve">. Available at: </w:t>
       </w:r>
-      <w:hyperlink r:id="rId8" w:tgtFrame="_new" w:history="1">
+      <w:hyperlink r:id="rId9" w:tgtFrame="_new" w:history="1">
         <w:r>
           <w:rPr>
             <w:rStyle w:val="Hyperlink"/>
@@ -2197,7 +2164,7 @@
         </w:rPr>
         <w:t xml:space="preserve">. Available at: </w:t>
       </w:r>
-      <w:hyperlink r:id="rId9" w:tgtFrame="_new" w:history="1">
+      <w:hyperlink r:id="rId10" w:tgtFrame="_new" w:history="1">
         <w:r>
           <w:rPr>
             <w:rStyle w:val="Hyperlink"/>
@@ -2238,7 +2205,7 @@
         </w:rPr>
         <w:t xml:space="preserve">. Available at: </w:t>
       </w:r>
-      <w:hyperlink r:id="rId10" w:tgtFrame="_new" w:history="1">
+      <w:hyperlink r:id="rId11" w:tgtFrame="_new" w:history="1">
         <w:r>
           <w:rPr>
             <w:rStyle w:val="Hyperlink"/>
@@ -2265,27 +2232,27 @@
           <w:sz w:val="22"/>
           <w:szCs w:val="22"/>
         </w:rPr>
-        <w:t xml:space="preserve">9. </w:t>
-      </w:r>
-      <w:r>
+        <w:t>9. Appendix</w:t>
+      </w:r>
+    </w:p>
+    <w:p>
+      <w:pPr>
         <w:rPr>
           <w:b/>
           <w:bCs/>
           <w:sz w:val="22"/>
           <w:szCs w:val="22"/>
         </w:rPr>
-        <w:t>Appendix</w:t>
-      </w:r>
-    </w:p>
-    <w:p>
-      <w:pPr>
+      </w:pPr>
+      <w:r>
         <w:rPr>
           <w:b/>
           <w:bCs/>
           <w:sz w:val="22"/>
           <w:szCs w:val="22"/>
         </w:rPr>
-      </w:pPr>
+        <w:t>A</w:t>
+      </w:r>
       <w:r>
         <w:rPr>
           <w:b/>
@@ -2293,17 +2260,101 @@
           <w:sz w:val="22"/>
           <w:szCs w:val="22"/>
         </w:rPr>
-        <w:t>A</w:t>
-      </w:r>
-      <w:r>
+        <w:t>.1: Chapter Extraction Prompt</w:t>
+      </w:r>
+    </w:p>
+    <w:p>
+      <w:pPr>
+        <w:rPr>
+          <w:sz w:val="22"/>
+          <w:szCs w:val="22"/>
+        </w:rPr>
+      </w:pPr>
+      <w:r>
+        <w:rPr>
+          <w:sz w:val="22"/>
+          <w:szCs w:val="22"/>
+        </w:rPr>
+        <w:t>“You are extracting information from the Kazakhstan National Human Development Report 2002.</w:t>
+      </w:r>
+    </w:p>
+    <w:p>
+      <w:pPr>
+        <w:rPr>
+          <w:sz w:val="22"/>
+          <w:szCs w:val="22"/>
+        </w:rPr>
+      </w:pPr>
+      <w:r>
+        <w:rPr>
+          <w:sz w:val="22"/>
+          <w:szCs w:val="22"/>
+        </w:rPr>
+        <w:t>Return JSON with chapter number, chapter title, a summary under 100 words, key points,</w:t>
+      </w:r>
+    </w:p>
+    <w:p>
+      <w:pPr>
+        <w:rPr>
+          <w:sz w:val="22"/>
+          <w:szCs w:val="22"/>
+        </w:rPr>
+      </w:pPr>
+      <w:r>
+        <w:rPr>
+          <w:sz w:val="22"/>
+          <w:szCs w:val="22"/>
+        </w:rPr>
+        <w:t>important indicators or numbers, themes present, and limitations or uncertainties.</w:t>
+      </w:r>
+    </w:p>
+    <w:p>
+      <w:pPr>
+        <w:rPr>
+          <w:sz w:val="22"/>
+          <w:szCs w:val="22"/>
+        </w:rPr>
+      </w:pPr>
+      <w:r>
+        <w:rPr>
+          <w:sz w:val="22"/>
+          <w:szCs w:val="22"/>
+        </w:rPr>
+        <w:t>Rules: use only the chapter text, keep the summary under 100 words, and use an empty list</w:t>
+      </w:r>
+    </w:p>
+    <w:p>
+      <w:pPr>
+        <w:rPr>
+          <w:sz w:val="22"/>
+          <w:szCs w:val="22"/>
+        </w:rPr>
+      </w:pPr>
+      <w:r>
+        <w:rPr>
+          <w:sz w:val="22"/>
+          <w:szCs w:val="22"/>
+        </w:rPr>
+        <w:t>where no numerical value is found.”</w:t>
+      </w:r>
+    </w:p>
+    <w:p>
+      <w:pPr>
+        <w:rPr>
+          <w:sz w:val="22"/>
+          <w:szCs w:val="22"/>
+        </w:rPr>
+      </w:pPr>
+    </w:p>
+    <w:p>
+      <w:pPr>
         <w:rPr>
           <w:b/>
           <w:bCs/>
           <w:sz w:val="22"/>
           <w:szCs w:val="22"/>
         </w:rPr>
-        <w:t>.1</w:t>
-      </w:r>
+      </w:pPr>
       <w:r>
         <w:rPr>
           <w:b/>
@@ -2311,7 +2362,7 @@
           <w:sz w:val="22"/>
           <w:szCs w:val="22"/>
         </w:rPr>
-        <w:t>:</w:t>
+        <w:t>A</w:t>
       </w:r>
       <w:r>
         <w:rPr>
@@ -2320,96 +2371,67 @@
           <w:sz w:val="22"/>
           <w:szCs w:val="22"/>
         </w:rPr>
-        <w:t xml:space="preserve"> Chapter Extraction Prompt</w:t>
-      </w:r>
-    </w:p>
-    <w:p>
-      <w:pPr>
-        <w:rPr>
-          <w:sz w:val="22"/>
-          <w:szCs w:val="22"/>
-        </w:rPr>
-      </w:pPr>
-      <w:r>
-        <w:rPr>
-          <w:sz w:val="22"/>
-          <w:szCs w:val="22"/>
-        </w:rPr>
-        <w:t>“</w:t>
-      </w:r>
-      <w:r>
-        <w:rPr>
-          <w:sz w:val="22"/>
-          <w:szCs w:val="22"/>
-        </w:rPr>
-        <w:t>You are extracting information from the Kazakhstan National Human Development Report 2002.</w:t>
-      </w:r>
-    </w:p>
-    <w:p>
-      <w:pPr>
-        <w:rPr>
-          <w:sz w:val="22"/>
-          <w:szCs w:val="22"/>
-        </w:rPr>
-      </w:pPr>
-      <w:r>
-        <w:rPr>
-          <w:sz w:val="22"/>
-          <w:szCs w:val="22"/>
-        </w:rPr>
-        <w:t>Return JSON with chapter number, chapter title, a summary under 100 words, key points,</w:t>
-      </w:r>
-    </w:p>
-    <w:p>
-      <w:pPr>
-        <w:rPr>
-          <w:sz w:val="22"/>
-          <w:szCs w:val="22"/>
-        </w:rPr>
-      </w:pPr>
-      <w:r>
-        <w:rPr>
-          <w:sz w:val="22"/>
-          <w:szCs w:val="22"/>
-        </w:rPr>
-        <w:t>important indicators or numbers, themes present, and limitations or uncertainties.</w:t>
-      </w:r>
-    </w:p>
-    <w:p>
-      <w:pPr>
-        <w:rPr>
-          <w:sz w:val="22"/>
-          <w:szCs w:val="22"/>
-        </w:rPr>
-      </w:pPr>
-      <w:r>
-        <w:rPr>
-          <w:sz w:val="22"/>
-          <w:szCs w:val="22"/>
-        </w:rPr>
-        <w:t>Rules: use only the chapter text, keep the summary under 100 words, and use an empty list</w:t>
-      </w:r>
-    </w:p>
-    <w:p>
-      <w:pPr>
-        <w:rPr>
-          <w:sz w:val="22"/>
-          <w:szCs w:val="22"/>
-        </w:rPr>
-      </w:pPr>
-      <w:r>
-        <w:rPr>
-          <w:sz w:val="22"/>
-          <w:szCs w:val="22"/>
-        </w:rPr>
-        <w:t>where no numerical value is found.</w:t>
-      </w:r>
-      <w:r>
-        <w:rPr>
-          <w:sz w:val="22"/>
-          <w:szCs w:val="22"/>
-        </w:rPr>
-        <w:t>”</w:t>
+        <w:t>.2: Full-Report Extraction Prompt</w:t>
+      </w:r>
+    </w:p>
+    <w:p>
+      <w:pPr>
+        <w:rPr>
+          <w:sz w:val="22"/>
+          <w:szCs w:val="22"/>
+        </w:rPr>
+      </w:pPr>
+      <w:r>
+        <w:rPr>
+          <w:sz w:val="22"/>
+          <w:szCs w:val="22"/>
+        </w:rPr>
+        <w:t>“Use chapter-level model outputs, indicator evidence lines from the PDF, and deterministic</w:t>
+      </w:r>
+    </w:p>
+    <w:p>
+      <w:pPr>
+        <w:rPr>
+          <w:sz w:val="22"/>
+          <w:szCs w:val="22"/>
+        </w:rPr>
+      </w:pPr>
+      <w:r>
+        <w:rPr>
+          <w:sz w:val="22"/>
+          <w:szCs w:val="22"/>
+        </w:rPr>
+        <w:t>theme keyword counts. Return JSON containing report metadata, 5-8 key findings, 5-8 strengths,</w:t>
+      </w:r>
+    </w:p>
+    <w:p>
+      <w:pPr>
+        <w:rPr>
+          <w:sz w:val="22"/>
+          <w:szCs w:val="22"/>
+        </w:rPr>
+      </w:pPr>
+      <w:r>
+        <w:rPr>
+          <w:sz w:val="22"/>
+          <w:szCs w:val="22"/>
+        </w:rPr>
+        <w:t>5-8 challenges, core indicators, theme analysis, demographic or time trends for plots,</w:t>
+      </w:r>
+    </w:p>
+    <w:p>
+      <w:pPr>
+        <w:rPr>
+          <w:sz w:val="22"/>
+          <w:szCs w:val="22"/>
+        </w:rPr>
+      </w:pPr>
+      <w:r>
+        <w:rPr>
+          <w:sz w:val="22"/>
+          <w:szCs w:val="22"/>
+        </w:rPr>
+        <w:t>dashboard-ready plot ideas, and extraction notes. Preserve numerical values exactly where possible.”</w:t>
       </w:r>
     </w:p>
     <w:p>
@@ -2436,7 +2458,14 @@
           <w:sz w:val="22"/>
           <w:szCs w:val="22"/>
         </w:rPr>
-        <w:t>A</w:t>
+        <w:t>A.3:</w:t>
+      </w:r>
+      <w:r>
+        <w:rPr>
+          <w:sz w:val="22"/>
+          <w:szCs w:val="22"/>
+        </w:rPr>
+        <w:t xml:space="preserve"> </w:t>
       </w:r>
       <w:r>
         <w:rPr>
@@ -2445,159 +2474,6 @@
           <w:sz w:val="22"/>
           <w:szCs w:val="22"/>
         </w:rPr>
-        <w:t>.</w:t>
-      </w:r>
-      <w:r>
-        <w:rPr>
-          <w:b/>
-          <w:bCs/>
-          <w:sz w:val="22"/>
-          <w:szCs w:val="22"/>
-        </w:rPr>
-        <w:t>2</w:t>
-      </w:r>
-      <w:r>
-        <w:rPr>
-          <w:b/>
-          <w:bCs/>
-          <w:sz w:val="22"/>
-          <w:szCs w:val="22"/>
-        </w:rPr>
-        <w:t>: Full-Report Extraction Prompt</w:t>
-      </w:r>
-    </w:p>
-    <w:p>
-      <w:pPr>
-        <w:rPr>
-          <w:sz w:val="22"/>
-          <w:szCs w:val="22"/>
-        </w:rPr>
-      </w:pPr>
-      <w:r>
-        <w:rPr>
-          <w:sz w:val="22"/>
-          <w:szCs w:val="22"/>
-        </w:rPr>
-        <w:t>“</w:t>
-      </w:r>
-      <w:r>
-        <w:rPr>
-          <w:sz w:val="22"/>
-          <w:szCs w:val="22"/>
-        </w:rPr>
-        <w:t>Use chapter-level model outputs, indicator evidence lines from the PDF, and deterministic</w:t>
-      </w:r>
-    </w:p>
-    <w:p>
-      <w:pPr>
-        <w:rPr>
-          <w:sz w:val="22"/>
-          <w:szCs w:val="22"/>
-        </w:rPr>
-      </w:pPr>
-      <w:r>
-        <w:rPr>
-          <w:sz w:val="22"/>
-          <w:szCs w:val="22"/>
-        </w:rPr>
-        <w:t>theme keyword counts. Return JSON containing report metadata, 5-8 key findings, 5-8 strengths,</w:t>
-      </w:r>
-    </w:p>
-    <w:p>
-      <w:pPr>
-        <w:rPr>
-          <w:sz w:val="22"/>
-          <w:szCs w:val="22"/>
-        </w:rPr>
-      </w:pPr>
-      <w:r>
-        <w:rPr>
-          <w:sz w:val="22"/>
-          <w:szCs w:val="22"/>
-        </w:rPr>
-        <w:t>5-8 challenges, core indicators, theme analysis, demographic or time trends for plots,</w:t>
-      </w:r>
-    </w:p>
-    <w:p>
-      <w:pPr>
-        <w:rPr>
-          <w:sz w:val="22"/>
-          <w:szCs w:val="22"/>
-        </w:rPr>
-      </w:pPr>
-      <w:r>
-        <w:rPr>
-          <w:sz w:val="22"/>
-          <w:szCs w:val="22"/>
-        </w:rPr>
-        <w:t>dashboard-ready plot ideas, and extraction notes. Preserve numerical values exactly where possible.</w:t>
-      </w:r>
-      <w:r>
-        <w:rPr>
-          <w:sz w:val="22"/>
-          <w:szCs w:val="22"/>
-        </w:rPr>
-        <w:t>”</w:t>
-      </w:r>
-    </w:p>
-    <w:p>
-      <w:pPr>
-        <w:rPr>
-          <w:sz w:val="22"/>
-          <w:szCs w:val="22"/>
-        </w:rPr>
-      </w:pPr>
-    </w:p>
-    <w:p>
-      <w:pPr>
-        <w:rPr>
-          <w:b/>
-          <w:bCs/>
-          <w:sz w:val="22"/>
-          <w:szCs w:val="22"/>
-        </w:rPr>
-      </w:pPr>
-      <w:r>
-        <w:rPr>
-          <w:b/>
-          <w:bCs/>
-          <w:sz w:val="22"/>
-          <w:szCs w:val="22"/>
-        </w:rPr>
-        <w:t>A.</w:t>
-      </w:r>
-      <w:r>
-        <w:rPr>
-          <w:b/>
-          <w:bCs/>
-          <w:sz w:val="22"/>
-          <w:szCs w:val="22"/>
-        </w:rPr>
-        <w:t>3</w:t>
-      </w:r>
-      <w:r>
-        <w:rPr>
-          <w:b/>
-          <w:bCs/>
-          <w:sz w:val="22"/>
-          <w:szCs w:val="22"/>
-        </w:rPr>
-        <w:t>:</w:t>
-      </w:r>
-      <w:r>
-        <w:rPr>
-          <w:sz w:val="22"/>
-          <w:szCs w:val="22"/>
-        </w:rPr>
-        <w:t xml:space="preserve"> </w:t>
-      </w:r>
-      <w:r>
-        <w:rPr>
-          <w:b/>
-          <w:bCs/>
-          <w:sz w:val="22"/>
-          <w:szCs w:val="22"/>
-        </w:rPr>
         <w:t>Evaluator Prompt</w:t>
       </w:r>
     </w:p>
@@ -2613,14 +2489,7 @@
           <w:sz w:val="22"/>
           <w:szCs w:val="22"/>
         </w:rPr>
-        <w:t>“</w:t>
-      </w:r>
-      <w:r>
-        <w:rPr>
-          <w:sz w:val="22"/>
-          <w:szCs w:val="22"/>
-        </w:rPr>
-        <w:t>Evaluate Qwen and Llama extractor outputs against source evidence lines. Score each model from</w:t>
+        <w:t>“Evaluate Qwen and Llama extractor outputs against source evidence lines. Score each model from</w:t>
       </w:r>
     </w:p>
     <w:p>
@@ -2665,14 +2534,7 @@
           <w:sz w:val="22"/>
           <w:szCs w:val="22"/>
         </w:rPr>
-        <w:t>agreements, disagreements, and a recommended final extraction strategy.</w:t>
-      </w:r>
-      <w:r>
-        <w:rPr>
-          <w:sz w:val="22"/>
-          <w:szCs w:val="22"/>
-        </w:rPr>
-        <w:t>”</w:t>
+        <w:t>agreements, disagreements, and a recommended final extraction strategy.”</w:t>
       </w:r>
     </w:p>
     <w:sectPr>
@@ -3288,6 +3150,7 @@
   <w:style w:type="character" w:default="1" w:styleId="DefaultParagraphFont">
     <w:name w:val="Default Paragraph Font"/>
     <w:uiPriority w:val="1"/>
+    <w:semiHidden/>
     <w:unhideWhenUsed/>
   </w:style>
   <w:style w:type="table" w:default="1" w:styleId="TableNormal">

</xml_diff>